<commit_message>
Fig. 2: move legends above data to avoid overlap
Co-Authored-By: Claude Opus 5.5 <noreply@anthropic.com>
Claude-Session: https://claude.ai/code/session_01WEkvNm1Pm2E6F6PKPZYgze
</commit_message>
<xml_diff>
--- a/output/endophyte_consortia_paper/Endophyte_Salinity_Rice_Manuscript_Revised.docx
+++ b/output/endophyte_consortia_paper/Endophyte_Salinity_Rice_Manuscript_Revised.docx
@@ -4368,7 +4368,7 @@
       <w:r>
         <w:drawing>
           <wp:inline xmlns:a="http://schemas.openxmlformats.org/drawingml/2006/main" xmlns:pic="http://schemas.openxmlformats.org/drawingml/2006/picture">
-            <wp:extent cx="5724000" cy="3448256"/>
+            <wp:extent cx="5724000" cy="3292705"/>
             <wp:docPr id="2" name="Picture 2"/>
             <wp:cNvGraphicFramePr>
               <a:graphicFrameLocks noChangeAspect="1"/>
@@ -4389,7 +4389,7 @@
                   <pic:spPr>
                     <a:xfrm>
                       <a:off x="0" y="0"/>
-                      <a:ext cx="5724000" cy="3448256"/>
+                      <a:ext cx="5724000" cy="3292705"/>
                     </a:xfrm>
                     <a:prstGeom prst="rect"/>
                   </pic:spPr>

</xml_diff>

<commit_message>
Manuscript: impersonal voice, Fig. 2 results text matched to dose-response plot, reference fix
Co-Authored-By: Claude Opus 5.5 <noreply@anthropic.com>
Claude-Session: https://claude.ai/code/session_01WEkvNm1Pm2E6F6PKPZYgze
</commit_message>
<xml_diff>
--- a/output/endophyte_consortia_paper/Endophyte_Salinity_Rice_Manuscript_Revised.docx
+++ b/output/endophyte_consortia_paper/Endophyte_Salinity_Rice_Manuscript_Revised.docx
@@ -171,7 +171,7 @@
           <w:color w:val="000000"/>
           <w:sz w:val="24"/>
         </w:rPr>
-        <w:t xml:space="preserve">Salinity limits rice yields on roughly one billion hectares of salt-affected land, and the seedling stage is where the crop is most exposed. We tested whether six rice endophytes (IS-01 to IS-06) and five dual-strain consortia built from them (C1-3, C1-5, C2-3, C2-5, C4-5) keep seedlings of the salt-susceptible cultivar IR-64 growing and metabolically stable under 0, 50, 100 and 150 mM NaCl. At 150 mM, salinity cut seedling vigour index (SVI) by 57.7%, chlorophyll </w:t>
+        <w:t xml:space="preserve">Salinity limits rice yields on roughly one billion hectares of salt-affected land, and the seedling stage is where the crop is most exposed. This study tested whether six rice endophytes (IS-01 to IS-06) and five dual-strain consortia assembled from these isolates (C1-3, C1-5, C2-3, C2-5, C4-5) keep seedlings of the salt-susceptible cultivar IR-64 growing and metabolically stable under 0, 50, 100 and 150 mM NaCl. At 150 mM, salinity cut seedling vigour index (SVI) by 57.7%, chlorophyll </w:t>
       </w:r>
       <w:r>
         <w:rPr>
@@ -454,7 +454,7 @@
           <w:color w:val="000000"/>
           <w:sz w:val="24"/>
         </w:rPr>
-        <w:t>Rice feeds more than half of the world's population, yet it is one of the more salt-sensitive cereals, and its sensitivity peaks during seedling establishment and again at flowering (Singh et al., 2021). The problem is large. About one billion hectares of land carry some form of salinity or sodicity (Basak et al., 2022), and irrigated rice systems in South and Southeast Asia sit squarely inside that footprint (Saleem et al., 2025). Breeding has produced tolerant cultivars, but progress is slow because tolerance is controlled by many genes acting at different growth stages (Ismail &amp; Horie, 2017). Farmers on marginal saline land need something they can use this season.</w:t>
+        <w:t>Rice feeds more than half of the world's population, yet it is one of the more salt-sensitive cereals, and its sensitivity peaks during seedling establishment and again at flowering (Singh et al., 2021). The problem is large. About one billion hectares of land carry some form of salinity or sodicity (Basak et al., 2022), and irrigated rice systems in South and Southeast Asia sit squarely inside that footprint (Saleem et al., 2025). Breeding has produced tolerant cultivars, but progress is slow because tolerance is controlled by many genes acting at different growth stages (Ismail &amp; Horie, 2017). Interventions that can be deployed within a single cropping season are therefore needed on marginal saline land.</w:t>
       </w:r>
     </w:p>
     <w:p>
@@ -589,7 +589,7 @@
           <w:color w:val="000000"/>
           <w:sz w:val="24"/>
         </w:rPr>
-        <w:t xml:space="preserve"> among the genera most often isolated (Santoyo et al., 2016). Because they already live inside the host, endophytes are thought to face less competition from the soil microflora than rhizosphere inoculants do. Seed-borne endophytes are particularly interesting. They travel with the seed, colonize the seedling early and can be passed on vertically (Walitang et al., 2017). Their composition in rice shifts with host genotype and with salt stress itself (Walitang et al., 2018), which hints that some of these bacteria have been selected for life in a saline host.</w:t>
+        <w:t xml:space="preserve"> among the genera most often isolated (Santoyo et al., 2016). Because endophytes already occupy host tissues, they are thought to face less competition from the soil microflora than rhizosphere inoculants do. Seed-borne endophytes are particularly interesting. They travel with the seed, colonize the seedling early and can be passed on vertically (Walitang et al., 2017). Their composition in rice shifts with host genotype and with salt stress itself (Walitang et al., 2018), which hints that some of these bacteria have been selected for life in a saline host.</w:t>
       </w:r>
     </w:p>
     <w:p>
@@ -699,7 +699,7 @@
           <w:color w:val="000000"/>
           <w:sz w:val="24"/>
         </w:rPr>
-        <w:t>This study was built around those two gaps. Our objectives were to (i) assemble dual-strain consortia from six rice endophytes and check their in vitro compatibility; (ii) compare isolates and consortia for effects on germination and seedling vigour in a laboratory assay; (iii) test the same inoculants in a polyhouse pot trial under 0, 50, 100 and 150 mM NaCl, measuring growth, photosynthetic pigments, phenolics, soluble protein, soluble sugars and DPPH radical scavenging; and (iv) rank the inoculants with salinity-induced reduction and mitigation indices, a composite membership index and principal component analysis. We expected at least one consortium to outperform both of its parent strains under severe salinity, and that the benefit of mixing would depend on which strains were paired.</w:t>
+        <w:t>This study was built around those two gaps. The objectives were to (i) assemble dual-strain consortia from six rice endophytes and check their in vitro compatibility; (ii) compare isolates and consortia for effects on germination and seedling vigour in a laboratory assay; (iii) test the same inoculants in a polyhouse pot trial under 0, 50, 100 and 150 mM NaCl, measuring growth, photosynthetic pigments, phenolics, soluble protein, soluble sugars and DPPH radical scavenging; and (iv) rank the inoculants with salinity-induced reduction and mitigation indices, a composite membership index and principal component analysis. It was hypothesized that at least one consortium to outperform both of its parent strains under severe salinity, and that the benefit of mixing would depend on which strains were paired.</w:t>
       </w:r>
     </w:p>
     <w:p>
@@ -1904,7 +1904,7 @@
           <w:color w:val="000000"/>
           <w:sz w:val="24"/>
         </w:rPr>
-        <w:t>All five pairings grew as uniform, stable cultures, with no inhibition zones or altered colony forms where partners met; consortium plates also looked denser than single-isolate plates. This shows that the partners can share a plate, not that they cooperate in the plant.</w:t>
+        <w:t>All five pairings grew as uniform, stable cultures, with no inhibition zones or altered colony forms where partners met; consortium plates also looked denser than single-isolate plates. This shows that the partners can share a plate, not that the strains cooperate within the plant.</w:t>
       </w:r>
     </w:p>
     <w:p>
@@ -4317,7 +4317,28 @@
           <w:color w:val="000000"/>
           <w:sz w:val="24"/>
         </w:rPr>
-        <w:t>Salinity lowered pot germination from 83.3% at 0 mM to 60.0% at 150 mM (</w:t>
+        <w:t>Germination declined with increasing NaCl in every treatment (Fig. 2). In uninoculated plants it fell from 83.3% at 0 mM to 60.0% at 150 mM, and the salinity effect was highly significant in both experiments (isolates LR χ</w:t>
+      </w:r>
+      <w:r>
+        <w:rPr>
+          <w:rFonts w:ascii="Times New Roman" w:hAnsi="Times New Roman" w:eastAsia="Times New Roman"/>
+          <w:b w:val="0"/>
+          <w:i w:val="0"/>
+          <w:color w:val="000000"/>
+          <w:sz w:val="24"/>
+          <w:vertAlign w:val="superscript"/>
+        </w:rPr>
+        <w:t>2</w:t>
+      </w:r>
+      <w:r>
+        <w:rPr>
+          <w:rFonts w:ascii="Times New Roman" w:hAnsi="Times New Roman" w:eastAsia="Times New Roman"/>
+          <w:b w:val="0"/>
+          <w:i w:val="0"/>
+          <w:color w:val="000000"/>
+          <w:sz w:val="24"/>
+        </w:rPr>
+        <w:t xml:space="preserve"> = 34.84, df = 3, </w:t>
       </w:r>
       <w:r>
         <w:rPr>
@@ -4337,7 +4358,28 @@
           <w:color w:val="000000"/>
           <w:sz w:val="24"/>
         </w:rPr>
-        <w:t xml:space="preserve"> &lt; 0.001 in both experiments; Fig. 2). Inoculation shifted germination upward in most treatments, for example IS-06 to 70.0% and C4-5 to 76.7% at 150 mM, but neither the inoculant effect (</w:t>
+        <w:t xml:space="preserve"> &lt; 0.001; consortia LR χ</w:t>
+      </w:r>
+      <w:r>
+        <w:rPr>
+          <w:rFonts w:ascii="Times New Roman" w:hAnsi="Times New Roman" w:eastAsia="Times New Roman"/>
+          <w:b w:val="0"/>
+          <w:i w:val="0"/>
+          <w:color w:val="000000"/>
+          <w:sz w:val="24"/>
+          <w:vertAlign w:val="superscript"/>
+        </w:rPr>
+        <w:t>2</w:t>
+      </w:r>
+      <w:r>
+        <w:rPr>
+          <w:rFonts w:ascii="Times New Roman" w:hAnsi="Times New Roman" w:eastAsia="Times New Roman"/>
+          <w:b w:val="0"/>
+          <w:i w:val="0"/>
+          <w:color w:val="000000"/>
+          <w:sz w:val="24"/>
+        </w:rPr>
+        <w:t xml:space="preserve"> = 23.15, df = 3, </w:t>
       </w:r>
       <w:r>
         <w:rPr>
@@ -4357,7 +4399,109 @@
           <w:color w:val="000000"/>
           <w:sz w:val="24"/>
         </w:rPr>
-        <w:t xml:space="preserve"> = 0.071 and 0.065) nor the interaction was significant.</w:t>
+        <w:t xml:space="preserve"> &lt; 0.001). At 150 mM, IS-06 and IS-05 (70.0%) and C4-5 (76.7%) remained above the control, whereas IS-02 (56.7%), IS-03 (53.3%) and C2-3 (50.0%) fell below it. These differences lay within overlapping 95% confidence intervals, and neither the inoculant effect (isolates LR χ</w:t>
+      </w:r>
+      <w:r>
+        <w:rPr>
+          <w:rFonts w:ascii="Times New Roman" w:hAnsi="Times New Roman" w:eastAsia="Times New Roman"/>
+          <w:b w:val="0"/>
+          <w:i w:val="0"/>
+          <w:color w:val="000000"/>
+          <w:sz w:val="24"/>
+          <w:vertAlign w:val="superscript"/>
+        </w:rPr>
+        <w:t>2</w:t>
+      </w:r>
+      <w:r>
+        <w:rPr>
+          <w:rFonts w:ascii="Times New Roman" w:hAnsi="Times New Roman" w:eastAsia="Times New Roman"/>
+          <w:b w:val="0"/>
+          <w:i w:val="0"/>
+          <w:color w:val="000000"/>
+          <w:sz w:val="24"/>
+        </w:rPr>
+        <w:t xml:space="preserve"> = 11.61, df = 6, </w:t>
+      </w:r>
+      <w:r>
+        <w:rPr>
+          <w:rFonts w:ascii="Times New Roman" w:hAnsi="Times New Roman" w:eastAsia="Times New Roman"/>
+          <w:b w:val="0"/>
+          <w:i/>
+          <w:color w:val="000000"/>
+          <w:sz w:val="24"/>
+        </w:rPr>
+        <w:t>p</w:t>
+      </w:r>
+      <w:r>
+        <w:rPr>
+          <w:rFonts w:ascii="Times New Roman" w:hAnsi="Times New Roman" w:eastAsia="Times New Roman"/>
+          <w:b w:val="0"/>
+          <w:i w:val="0"/>
+          <w:color w:val="000000"/>
+          <w:sz w:val="24"/>
+        </w:rPr>
+        <w:t xml:space="preserve"> = 0.071; consortia LR χ</w:t>
+      </w:r>
+      <w:r>
+        <w:rPr>
+          <w:rFonts w:ascii="Times New Roman" w:hAnsi="Times New Roman" w:eastAsia="Times New Roman"/>
+          <w:b w:val="0"/>
+          <w:i w:val="0"/>
+          <w:color w:val="000000"/>
+          <w:sz w:val="24"/>
+          <w:vertAlign w:val="superscript"/>
+        </w:rPr>
+        <w:t>2</w:t>
+      </w:r>
+      <w:r>
+        <w:rPr>
+          <w:rFonts w:ascii="Times New Roman" w:hAnsi="Times New Roman" w:eastAsia="Times New Roman"/>
+          <w:b w:val="0"/>
+          <w:i w:val="0"/>
+          <w:color w:val="000000"/>
+          <w:sz w:val="24"/>
+        </w:rPr>
+        <w:t xml:space="preserve"> = 10.40, df = 5, </w:t>
+      </w:r>
+      <w:r>
+        <w:rPr>
+          <w:rFonts w:ascii="Times New Roman" w:hAnsi="Times New Roman" w:eastAsia="Times New Roman"/>
+          <w:b w:val="0"/>
+          <w:i/>
+          <w:color w:val="000000"/>
+          <w:sz w:val="24"/>
+        </w:rPr>
+        <w:t>p</w:t>
+      </w:r>
+      <w:r>
+        <w:rPr>
+          <w:rFonts w:ascii="Times New Roman" w:hAnsi="Times New Roman" w:eastAsia="Times New Roman"/>
+          <w:b w:val="0"/>
+          <w:i w:val="0"/>
+          <w:color w:val="000000"/>
+          <w:sz w:val="24"/>
+        </w:rPr>
+        <w:t xml:space="preserve"> = 0.065) nor the inoculant × NaCl interaction (</w:t>
+      </w:r>
+      <w:r>
+        <w:rPr>
+          <w:rFonts w:ascii="Times New Roman" w:hAnsi="Times New Roman" w:eastAsia="Times New Roman"/>
+          <w:b w:val="0"/>
+          <w:i/>
+          <w:color w:val="000000"/>
+          <w:sz w:val="24"/>
+        </w:rPr>
+        <w:t>p</w:t>
+      </w:r>
+      <w:r>
+        <w:rPr>
+          <w:rFonts w:ascii="Times New Roman" w:hAnsi="Times New Roman" w:eastAsia="Times New Roman"/>
+          <w:b w:val="0"/>
+          <w:i w:val="0"/>
+          <w:color w:val="000000"/>
+          <w:sz w:val="24"/>
+        </w:rPr>
+        <w:t xml:space="preserve"> = 0.999 and 0.835) was significant. The near-parallel dose–response lines in Fig. 2 thus indicate that salt reduced germination to a similar extent irrespective of inoculation.</w:t>
       </w:r>
     </w:p>
     <w:p>
@@ -11494,7 +11638,7 @@
           <w:color w:val="000000"/>
           <w:sz w:val="24"/>
         </w:rPr>
-        <w:t>Soluble sugars behaved less conventionally. Tolerant plants usually accumulate sugars as osmolytes (Parida &amp; Das, 2005; Mahajan &amp; Tuteja, 2005), yet in IR-64 they fell by 67.5%, together with protein and phenolics. We read this as a susceptible cultivar unable to keep carbon assimilation going well enough to fund an osmotic response, consistent with reviews that place photosynthetic capacity upstream of most salt-tolerance traits in rice (Sackey et al., 2025) and with the broader view of salt signalling as a reprogramming of metabolism (Zhu, 2016). Our data cannot prove the causal order, because gas exchange was not measured.</w:t>
+        <w:t>Soluble sugars behaved less conventionally. Tolerant plants usually accumulate sugars as osmolytes (Parida &amp; Das, 2005; Mahajan &amp; Tuteja, 2005), yet in IR-64 sugars fell by 67.5%, together with protein and phenolics. This pattern is interpreted as a susceptible cultivar unable to keep carbon assimilation going well enough to fund an osmotic response, consistent with reviews that place photosynthetic capacity upstream of most salt-tolerance traits in rice (Sackey et al., 2025) and with the broader view of salt signalling as a reprogramming of metabolism (Zhu, 2016). The present data cannot establish the causal order, because gas exchange was not measured.</w:t>
       </w:r>
     </w:p>
     <w:p>
@@ -11528,7 +11672,7 @@
           <w:color w:val="000000"/>
           <w:sz w:val="24"/>
         </w:rPr>
-        <w:t xml:space="preserve">The clearest negative result is that no inoculant changed germination detectably. Many bacterization studies report higher germination (Sagar et al., 2020; Ali et al., 2022), and our direction of effect agrees, with IS-06 and C4-5 10–17 percentage points above the control at 150 mM. But with 30 seeds per treatment, Fisher's exact test needs a difference of about 27 points to reach significance, so the design could not confirm effects of this size. Germination was also one of the least salt-sensitive traits (SIR 28%, against 52% for root length and 83% for chlorophyll </w:t>
+        <w:t xml:space="preserve">The clearest negative result is that no inoculant changed germination detectably. Many bacterization studies report higher germination (Sagar et al., 2020; Ali et al., 2022), and the direction of effect for the best inoculants agrees, with IS-06 and C4-5 10–17 percentage points above the control at 150 mM (Fig. 2), although IS-02, IS-03 and C2-3 fell below it. But with 30 seeds per treatment, Fisher's exact test needs a difference of about 27 points to reach significance, so the design could not confirm effects of this size. Germination was also one of the least salt-sensitive traits (SIR 28%, against 52% for root length and 83% for chlorophyll </w:t>
       </w:r>
       <w:r>
         <w:rPr>
@@ -11742,7 +11886,7 @@
           <w:color w:val="000000"/>
           <w:sz w:val="24"/>
         </w:rPr>
-        <w:t xml:space="preserve"> would separate them. The sugar data add one point: IS-06 kept 89% of its unstressed sugar against 33% in the control, which probably reflects preserved chlorophyll feeding a steady carbon supply. Inoculation-driven accumulation of compatible solutes is well documented (Arora et al., 2020; Ramasamy &amp; Mahawar, 2023), but our data cannot show whether the extra sugar served osmotic adjustment or simply reflects higher assimilation.</w:t>
+        <w:t xml:space="preserve"> would separate them. The sugar data add one point: IS-06 kept 89% of its unstressed sugar against 33% in the control, which probably reflects preserved chlorophyll feeding a steady carbon supply. Inoculation-driven accumulation of compatible solutes is well documented (Arora et al., 2020; Ramasamy &amp; Mahawar, 2023), but the present data cannot show whether the extra sugar served osmotic adjustment or simply reflects higher assimilation.</w:t>
       </w:r>
     </w:p>
     <w:p>
@@ -11776,7 +11920,7 @@
           <w:color w:val="000000"/>
           <w:sz w:val="24"/>
         </w:rPr>
-        <w:t>Meta-analysis predicts that consortia outperform single strains (Liu et al., 2023); our results support a more guarded version. On the average CMI, only C4-5 beat both of its parents, C2-5 sat between its parents, and C1-3, C1-5 and C2-3 ranked below both. C4-5 combined the second- and third-ranked isolates and, at 150 mM, exceeded both parents for protein (181.51 vs. 133.45 and 138.26 µg mL</w:t>
+        <w:t>Meta-analysis predicts that consortia outperform single strains (Liu et al., 2023); the present results support a more guarded version. On the average CMI, only C4-5 beat both of its parents, C2-5 sat between its parents, and C1-3, C1-5 and C2-3 ranked below both. C4-5 combined the second- and third-ranked isolates and, at 150 mM, exceeded both parents for protein (181.51 vs. 133.45 and 138.26 µg mL</w:t>
       </w:r>
       <w:r>
         <w:rPr>
@@ -11936,7 +12080,7 @@
           <w:color w:val="000000"/>
           <w:sz w:val="24"/>
         </w:rPr>
-        <w:t>The isolates still need confirmed taxonomic identity and quantified growth-promoting traits before they can be compared with published inoculants or registered (Afzal et al., 2019; Ganie et al., 2021). Biochemical values are expressed per volume of extract; the fixed tissue-to-solvent ratio makes treatments comparable, but not directly with per-gram data from other studies. Several assays recorded identical replicate SDs (±0.15), probably analytical rather than biological replication, which inflates F; effect sizes and rankings are the more reliable guide. Colonization was not verified by re-isolation or marker tracking (Walitang et al., 2017; Gupta et al., 2023), and ion contents, oxidative-damage markers and antioxidant enzymes were outside the scope of this trial. Finally, the trial ended at 45 DAS in pots, and seedling-stage tolerance in rice correlates only weakly with tolerance at flowering (Singh et al., 2021). Salt-tolerant rhizobacteria have improved rice yield in saline soil (Shultana et al., 2020), so yield-stage field testing of IS-06 and C4-5, ideally with a tolerant cultivar since host genotype shapes the endophytic community (Walitang et al., 2018; Wang et al., 2025), is the logical next step.</w:t>
+        <w:t>The isolates still need confirmed taxonomic identity and quantified growth-promoting traits before these isolates can be compared with published inoculants or registered (Afzal et al., 2019; Ganie et al., 2021). Biochemical values are expressed per volume of extract; the fixed tissue-to-solvent ratio makes treatments comparable, but not directly with per-gram data from other studies. Several assays recorded identical replicate SDs (±0.15), probably analytical rather than biological replication, which inflates F; effect sizes and rankings are the more reliable guide. Colonization was not verified by re-isolation or marker tracking (Walitang et al., 2017; Gupta et al., 2023), and ion contents, oxidative-damage markers and antioxidant enzymes were outside the scope of this trial. Finally, the trial ended at 45 DAS in pots, and seedling-stage tolerance in rice correlates only weakly with tolerance at flowering (Singh et al., 2021). Salt-tolerant rhizobacteria have improved rice yield in saline soil (Shultana et al., 2020), so yield-stage field testing of IS-06 and C4-5, ideally with a tolerant cultivar since host genotype shapes the endophytic community (Walitang et al., 2018; Wang et al., 2025), is the logical next step.</w:t>
       </w:r>
     </w:p>
     <w:p>

</xml_diff>